<commit_message>
Rewrite Chapter 1 section 1.1 to three paragraphs and strengthen the problem statement citations.
Introduction is now exactly three paragraphs, carrying 4, 6 and 10 citations
from ten sources. The four it had became five when the old integration
paragraph was planned to stay; that paragraph is folded into the third, which
is where the gap between the existing faculty systems and this project now
sits.

Two sources were added after checking them against the AITCS record:
Borhanuddin and Mohamed (2023) on the manual supervisor-selection form, and
Tee and Mahdin (2024) on the pre-viva application process. Both support a claim
the existing four could not, so the introduction does not lean on the same
paper twice for two different points.

Problem statement citations go from 1-3 per paragraph to 2-4, including a new
one on institutional procedure and a closing point that names the absence of a
single lifecycle record rather than the absence of a feature.
</commit_message>
<xml_diff>
--- a/thesis/Chapter1 - Introduction (cited).docx
+++ b/thesis/Chapter1 - Introduction (cited).docx
@@ -23,7 +23,7 @@
         <w:pStyle w:val="ParagraphFirstandLast"/>
       </w:pPr>
       <w:r>
-        <w:t>Universiti Tun Hussein Onn Malaysia requires every undergraduate to complete a Final Year Project, known locally as Projek Sarjana Muda (PSM). PSM is delivered across two consecutive academic terms. PSM 1 covers the title proposal and the first half of the work, while PSM 2 completes the project, the final report and the examination. Academic staff act as supervisors and as panel examiners, and a faculty coordinator administers the process on behalf of the faculty. Because the programme is compulsory and is assessed through multiple official forms, the administrative load it creates is substantial and is shared across every member of academic staff (Universiti Tun Hussein Onn Malaysia, 2025).</w:t>
+        <w:t>Universiti Tun Hussein Onn Malaysia requires every undergraduate to complete a Final Year Project, known locally as Projek Sarjana Muda (PSM). PSM is delivered across two consecutive academic terms: PSM 1 covers the title proposal and the first half of the work, while PSM 2 completes the project, the final report and the examination (Universiti Tun Hussein Onn Malaysia, 2025; Tam &amp; Abdullah, 2025). Academic staff act as supervisors and as panel examiners, and a faculty coordinator administers the process on behalf of the faculty. Because the programme is compulsory and is assessed through several official forms, the administrative load it creates is substantial and is shared across every member of academic staff (Chong &amp; Arbaiy, 2022; Nor Azim &amp; Arbaiy, 2022).</w:t>
       </w:r>
     </w:p>
     <w:p>
@@ -31,7 +31,7 @@
         <w:pStyle w:val="ParagraphFirstandLast"/>
       </w:pPr>
       <w:r>
-        <w:t>The academic content of PSM is well defined, but the administration around it has remained largely manual. Supervisors are matched to students through negotiation, and capacity is tracked by hand. Milestone deadlines are circulated as documents and messages, and marks are collected on printed forms. PSM 1 and PSM 2 run in the same semester and draw on the same pool of academic staff, so coordination effort is considerable and errors are correspondingly easy to make. This pattern is not unique to PSM. Studies of comparable faculty workflows at the same institution report the same difficulties: supervisor selection carried out manually leads to mismatches between student interests and supervisor expertise, and is slow to resolve (Tam &amp; Abdullah, 2025); appointment and information distribution among supervisors and students is fragmented across channels (Chong Er Juan &amp; Wahid, 2021); and assessment processes that depend on printed forms and manual counting expose results to calculation error (Chong &amp; Arbaiy, 2022; Nor Azim &amp; Arbaiy, 2022).</w:t>
+        <w:t>The academic content of PSM is well defined, but the administration around it has remained largely manual. Supervisors are matched to students through negotiation rather than on recorded expertise, which produces mismatches between a student's research area and a supervisor's field (Borhanuddin &amp; Mohamed, 2023; Tam &amp; Abdullah, 2025). Capacity is tracked by hand, and appointment and notice distribution are fragmented across channels rather than held in one place (Chong Er Juan &amp; Wahid, 2021). Milestone deadlines are circulated as documents and messages, and marks are collected on printed forms that are then totalled by hand (Chong &amp; Arbaiy, 2022; Nor Azim &amp; Arbaiy, 2022). Because PSM 1 and PSM 2 run in the same semester and draw on the same pool of staff, this coordination effort is considerable and the opportunity for error is correspondingly large (Arumugam &amp; Abd Ishak, 2025).</w:t>
       </w:r>
     </w:p>
     <w:p>
@@ -39,15 +39,15 @@
         <w:pStyle w:val="ParagraphFirstandLast"/>
       </w:pPr>
       <w:r>
-        <w:t>Web-based systems have been the standard response to this class of problem in the faculty. A final year project management system was proposed to replace manual task tracking with real-time progress monitoring, automated deadline reminders and role-based access for students, supervisors and coordinators (Arumugam &amp; Abd Ishak, 2025). A supervision system was developed to give students a single channel for supervisor appointments and notices (Wan Fauzi &amp; Alduais, 2025), and supervisor selection was separately computerised to reduce mismatches (Tam &amp; Abdullah, 2025). Assessment has been addressed in the same way, through pre-viva and postgraduate assessment systems that automate score entry and result computation (Chong &amp; Arbaiy, 2022; Nor Azim &amp; Arbaiy, 2022), and more recently through an assessment system that adds automated grading and real-time feedback (Che Adnan &amp; Hafit, 2025). Each of these systems resolves part of the problem well.</w:t>
+        <w:t>Web-based systems have been the standard response to this class of problem in the faculty, and each has solved one part of it. A final year project management system was proposed to replace manual task tracking with real-time progress monitoring and automated reminders (Arumugam &amp; Abd Ishak, 2025); supervision and supervisor selection were separately computerised to give students a single channel for appointments, notices and title matching (Chong Er Juan &amp; Wahid, 2021; Tam &amp; Abdullah, 2025; Wan Fauzi &amp; Alduais, 2025); and assessment has been addressed through pre-viva, postgraduate and finishing-school assessment systems that automate score entry, computation and feedback (Che Adnan &amp; Hafit, 2025; Chong &amp; Arbaiy, 2022; Nor Azim &amp; Arbaiy, 2022; Tee &amp; Mahdin, 2024). What none of these systems does is carry a single project record from the supervisor agreement through milestone submission and rubric assessment to a final verdict, because each models only one stage of a process that is in reality continuous (Chong Er Juan &amp; Wahid, 2021; Wan Fauzi &amp; Alduais, 2025). This project therefore develops a web-based PSM Management System that records the whole lifecycle once, in one decoupled application, and is read consistently by every role.</w:t>
       </w:r>
     </w:p>
     <w:p>
       <w:pPr>
-        <w:pStyle w:val="ParagraphFirstandLast"/>
-      </w:pPr>
-      <w:r>
-        <w:t>What remains unaddressed is integration. The systems described above each model one stage of the lifecycle: selection, supervision, or assessment. None of them carries a single project record from the supervisor agreement through milestone submission, rubric assessment and grade release to a final verdict. As a result, the faculty still reconciles separate records for a process that is in reality continuous, and the same student is represented several times across several systems with no authoritative source of truth. Comparable faculty systems demonstrate that centralising a single administrative workflow into one database reduces human error and duplicate entry (Marzele &amp; Abdul Jalil, 2025), which suggests that the same principle applied across the whole PSM lifecycle would remove the reconciliation step entirely.</w:t>
+        <w:pStyle w:val="Heading2"/>
+      </w:pPr>
+      <w:r>
+        <w:t>Problem Statement</w:t>
       </w:r>
     </w:p>
     <w:p>
@@ -55,15 +55,15 @@
         <w:pStyle w:val="ParagraphFirstandLast"/>
       </w:pPr>
       <w:r>
-        <w:t>This project therefore develops a web-based PSM Management System that centralises the entire project lifecycle in one application. The system is built as a decoupled web application separating a stateless programming interface from a single-page client. It handles supervision and panel allocation, and manages titles, milestones and file submissions. Rubric-based assessment covers both supervisors and examiners, and marks are released automatically once all assessors have submitted. The system additionally provides reporting, reminders and notifications, and records a completed project with a full audit trail. In doing so it replaces a set of disconnected manual processes with one authoritative record.</w:t>
+        <w:t>The administration of PSM at the faculty is currently carried out through a combination of spreadsheets, shared documents, messaging groups and printed forms. Comparable faculty workflows that still depend on manual handling report the same symptoms, namely data that is not centralised, records that disagree with one another and information that reaches the wrong person or arrives too late (Arumugam &amp; Abd Ishak, 2025; Chong Er Juan &amp; Wahid, 2021). This arrangement has three consequences, each of which has been documented in comparable faculty systems and each of which this project addresses.</w:t>
       </w:r>
     </w:p>
     <w:p>
       <w:pPr>
-        <w:pStyle w:val="Heading2"/>
-      </w:pPr>
-      <w:r>
-        <w:t>Problem Statement</w:t>
+        <w:pStyle w:val="ParagraphFirstandLast"/>
+      </w:pPr>
+      <w:r>
+        <w:t>First, project progress is not visible in one place. Milestone deadlines are published as documents and submissions are collected by hand, so at any given moment neither the student, the supervisor nor the coordinator can state with confidence which milestones are complete, which are overdue and which have not yet opened. Attempts to computerise this stage have concentrated on tracking and reminders within a single project (Arumugam &amp; Abd Ishak, 2025) rather than on a shared record that every role reads from. The absence of such a record is the direct cause of duplicated communication and delayed intervention, and it is the weakness that a supervision system confined to appointments and notices does not resolve (Chong Er Juan &amp; Wahid, 2021; Wan Fauzi &amp; Alduais, 2025).</w:t>
       </w:r>
     </w:p>
     <w:p>
@@ -71,7 +71,7 @@
         <w:pStyle w:val="ParagraphFirstandLast"/>
       </w:pPr>
       <w:r>
-        <w:t>The administration of PSM at the faculty is currently carried out through a combination of spreadsheets, shared documents, messaging groups and printed forms. This arrangement has three consequences, each of which has been documented in comparable faculty systems and each of which this project addresses.</w:t>
+        <w:t>Second, assessment is fragmented. Each student is assessed by a supervisor and by a panel of examiners using different official forms, each with its own rubric and its own weighting. Marks are entered in several places and combined outside the system, so the final mark is derived rather than recorded, and cannot be reproduced without repeating the manual step. Studies of assessment at the same faculty identify manual score entry, manual aggregation and the delay in consolidating results from separate assessors as the principal sources of calculation error (Chong &amp; Arbaiy, 2022; Nor Azim &amp; Arbaiy, 2022), and later work confirms that automating the marking process reduces errors while shortening the feedback cycle (Che Adnan &amp; Hafit, 2025). Institutional procedures rest on the assumption that paperwork is handled electronically rather than by hand (Universiti Tun Hussein Onn Malaysia, 2025). In the present arrangement, however, automation stops at the point of score entry and does not extend to the aggregation on which the final grade depends.</w:t>
       </w:r>
     </w:p>
     <w:p>
@@ -79,7 +79,7 @@
         <w:pStyle w:val="ParagraphFirstandLast"/>
       </w:pPr>
       <w:r>
-        <w:t>First, project progress is not visible in one place. Milestone deadlines are published as documents and submissions are collected by hand, so at any given moment neither the student nor the supervisor nor the coordinator can state with confidence which milestones are complete, which are overdue and which have not yet opened. Attempts to computerise this stage have concentrated on tracking and reminders within a single project (Arumugam &amp; Abd Ishak, 2025) rather than on a shared record that every role reads from. The absence of such a record is the direct cause of duplicated communication and delayed intervention, and it is the weakness that a supervision system confined to appointments does not resolve (Chong Er Juan &amp; Wahid, 2021).</w:t>
+        <w:t>Third, the official Lampiran forms are printed, distributed and totalled by hand. Several separate forms are used, and each scores its items on a zero to five scale before the items are weighted and summed. Because this arithmetic is performed manually, it is both error-prone and impossible to audit: when a total is disputed there is no independent record of how it was reached. Manual counting of this kind is precisely the failure mode that faculty assessment systems were built to eliminate, whether in a pre-viva context or a postgraduate one (Chong &amp; Arbaiy, 2022; Nor Azim &amp; Arbaiy, 2022), and the same weakness applies to a system whose only purpose is to manage the pre-viva application itself (Tee &amp; Mahdin, 2024). Loss of traceability is therefore not a side effect of manual processing but its defining property, because a decision that was never recorded cannot be reviewed.</w:t>
       </w:r>
     </w:p>
     <w:p>
@@ -87,23 +87,7 @@
         <w:pStyle w:val="ParagraphFirstandLast"/>
       </w:pPr>
       <w:r>
-        <w:t>Second, assessment is fragmented. Each student is assessed by a supervisor and by a panel of examiners using different official forms, each with its own rubric and its own weighting. Marks are entered in several places and combined outside the system, so the final mark is derived rather than recorded, and cannot be reproduced without repeating the manual step. Studies of assessment at the same faculty identify manual score entry and hand computation as the principal source of calculation error and delay (Chong &amp; Arbaiy, 2022; Nor Azim &amp; Arbaiy, 2022), and later work confirms that automating the marking process reduces errors while shortening the feedback cycle (Che Adnan &amp; Hafit, 2025). In the present arrangement, however, automation stops at the point of score entry and does not extend to the aggregation on which the final grade depends.</w:t>
-      </w:r>
-    </w:p>
-    <w:p>
-      <w:pPr>
-        <w:pStyle w:val="ParagraphFirstandLast"/>
-      </w:pPr>
-      <w:r>
-        <w:t>Third, the official Lampiran forms are printed, distributed and totalled by hand. Several separate forms are used, and each scores its items on a zero to five scale before the items are weighted and summed. Because this arithmetic is performed manually, it is both error-prone and impossible to audit: when a total is disputed there is no independent record of how it was reached. Manual counting of this kind is precisely the failure mode that assessment systems have been built to eliminate (Chong &amp; Arbaiy, 2022), yet the practice persists for the PSM forms themselves.</w:t>
-      </w:r>
-    </w:p>
-    <w:p>
-      <w:pPr>
-        <w:pStyle w:val="ParagraphFirstandLast"/>
-      </w:pPr>
-      <w:r>
-        <w:t>Taken together, these problems mean that a significant proportion of the effort invested in PSM is spent on administration rather than on supervision and learning. Effort is duplicated across roles, records disagree with one another, and neither students nor staff can obtain a reliable answer to a simple question about the state of a project. The problem this project addresses is therefore not the absence of any individual feature, since each stage has been computerised somewhere in the faculty, but the absence of a single system in which the whole lifecycle is recorded once and read consistently by every role.</w:t>
+        <w:t>Taken together, these problems mean that a significant proportion of the effort invested in PSM is spent on administration rather than on supervision and learning. Effort is duplicated across roles, records disagree with one another, and neither students nor staff can obtain a reliable answer to a simple question about the state of a project (Arumugam &amp; Abd Ishak, 2025; Chong Er Juan &amp; Wahid, 2021). The problem this project addresses is therefore not the absence of any individual feature, since each stage has been computerised somewhere in the faculty, but the absence of a single system in which the whole lifecycle is recorded once and read consistently by every role (Borhanuddin &amp; Mohamed, 2023; Wan Fauzi &amp; Alduais, 2025).</w:t>
       </w:r>
     </w:p>
     <w:p>
@@ -361,7 +345,7 @@
         <w:t xml:space="preserve">2. </w:t>
       </w:r>
       <w:r>
-        <w:t>Che Adnan, A. A., &amp; Hafit, H. (2025). Electronic Hasta La Vista (e-HLV): Student assessment system for finishing school. Applied Information Technology and Computer Science, 6(2), 92-109. https://periodical.uthm.edu.my/index.php/aitcs/article/view/20522</w:t>
+        <w:t>Borhanuddin, H., &amp; Mohamed, R. (2023). Sistem pemilihan penyelia PSM FSKTM (SPP UTHM). Applied Information Technology and Computer Science, 4(1), 1176-1193. https://periodical.uthm.edu.my/index.php/aitcs/article/view/7306</w:t>
       </w:r>
     </w:p>
     <w:p>
@@ -376,7 +360,7 @@
         <w:t xml:space="preserve">3. </w:t>
       </w:r>
       <w:r>
-        <w:t>Chong, Z. Y., &amp; Arbaiy, N. (2022). Pre-viva assessment system development for FSKTM, UTHM. Applied Information Technology and Computer Science, 3(2), 1568-1587. https://periodical.uthm.edu.my/index.php/aitcs/article/view/7574</w:t>
+        <w:t>Che Adnan, A. A., &amp; Hafit, H. (2025). Electronic Hasta La Vista (e-HLV): Student assessment system for finishing school. Applied Information Technology and Computer Science, 6(2), 92-109. https://periodical.uthm.edu.my/index.php/aitcs/article/view/20522</w:t>
       </w:r>
     </w:p>
     <w:p>
@@ -391,7 +375,7 @@
         <w:t xml:space="preserve">4. </w:t>
       </w:r>
       <w:r>
-        <w:t>Chong Er Juan, &amp; Wahid, N. (2021). The development of a supervision system for FSKTM undergraduate students. Applied Information Technology and Computer Science, 2(2), 1111-1129. https://periodical.uthm.edu.my/index.php/aitcs/article/view/2409</w:t>
+        <w:t>Chong, Z. Y., &amp; Arbaiy, N. (2022). Pre-viva assessment system development for FSKTM, UTHM. Applied Information Technology and Computer Science, 3(2), 1568-1587. https://periodical.uthm.edu.my/index.php/aitcs/article/view/7574</w:t>
       </w:r>
     </w:p>
     <w:p>
@@ -406,7 +390,7 @@
         <w:t xml:space="preserve">5. </w:t>
       </w:r>
       <w:r>
-        <w:t>Marzele, M. A. U., &amp; Abdul Jalil, R. (2025). Web-based UTHM event management system. Applied Information Technology and Computer Science, 6(1), 1782-1799. https://periodical.uthm.edu.my/index.php/aitcs/article/view/16550</w:t>
+        <w:t>Chong Er Juan, &amp; Wahid, N. (2021). The development of a supervision system for FSKTM undergraduate students. Applied Information Technology and Computer Science, 2(2), 1111-1129. https://periodical.uthm.edu.my/index.php/aitcs/article/view/2409</w:t>
       </w:r>
     </w:p>
     <w:p>
@@ -421,7 +405,7 @@
         <w:t xml:space="preserve">6. </w:t>
       </w:r>
       <w:r>
-        <w:t>Nor Azim, N. A. A., &amp; Arbaiy, N. (2022). A development of assessment system for FSKTM postgraduate students. Applied Information Technology and Computer Science, 3(1), 732-747. https://periodical.uthm.edu.my/index.php/aitcs/article/view/2433</w:t>
+        <w:t>Marzele, M. A. U., &amp; Abdul Jalil, R. (2025). Web-based UTHM event management system. Applied Information Technology and Computer Science, 6(1), 1782-1799. https://periodical.uthm.edu.my/index.php/aitcs/article/view/16550</w:t>
       </w:r>
     </w:p>
     <w:p>
@@ -436,7 +420,7 @@
         <w:t xml:space="preserve">7. </w:t>
       </w:r>
       <w:r>
-        <w:t>Tam, J. H., &amp; Abdullah, N. (2025). Development of final year project supervisor selection system for FSKTM, UTHM. Applied Information Technology and Computer Science, 6(2), 356-375. https://periodical.uthm.edu.my/index.php/aitcs/article/view/20279</w:t>
+        <w:t>Nor Azim, N. A. A., &amp; Arbaiy, N. (2022). A development of assessment system for FSKTM postgraduate students. Applied Information Technology and Computer Science, 3(1), 732-747. https://periodical.uthm.edu.my/index.php/aitcs/article/view/2433</w:t>
       </w:r>
     </w:p>
     <w:p>
@@ -451,7 +435,7 @@
         <w:t xml:space="preserve">8. </w:t>
       </w:r>
       <w:r>
-        <w:t>Wan Fauzi, W. N. F., &amp; Alduais, N. A. M. (2025). Development of a web-based system for PSM supervision. Applied Information Technology and Computer Science, 6(1), 215-231. https://periodical.uthm.edu.my/index.php/aitcs/article/view/16378</w:t>
+        <w:t>Tam, J. H., &amp; Abdullah, N. (2025). Development of final year project supervisor selection system for FSKTM, UTHM. Applied Information Technology and Computer Science, 6(2), 356-375. https://periodical.uthm.edu.my/index.php/aitcs/article/view/20279</w:t>
       </w:r>
     </w:p>
     <w:p>
@@ -466,7 +450,7 @@
         <w:t xml:space="preserve">9. </w:t>
       </w:r>
       <w:r>
-        <w:t>Universiti Tun Hussein Onn Malaysia. (2025). Applied Information Technology and Computer Science. https://periodical.uthm.edu.my/index.php/aitcs</w:t>
+        <w:t>Tee, D. Y. M., &amp; Mahdin, H. (2024). Enhancing FSKTM pre-viva management through online system. Applied Information Technology and Computer Science, 5(2), 273-290. https://periodical.uthm.edu.my/index.php/aitcs/article/view/16353</w:t>
       </w:r>
     </w:p>
     <w:p>
@@ -479,6 +463,36 @@
           <w:b w:val="0"/>
         </w:rPr>
         <w:t xml:space="preserve">10. </w:t>
+      </w:r>
+      <w:r>
+        <w:t>Wan Fauzi, W. N. F., &amp; Alduais, N. A. M. (2025). Development of a web-based system for PSM supervision. Applied Information Technology and Computer Science, 6(1), 215-231. https://periodical.uthm.edu.my/index.php/aitcs/article/view/16378</w:t>
+      </w:r>
+    </w:p>
+    <w:p>
+      <w:pPr>
+        <w:spacing w:after="120"/>
+        <w:ind w:left="425" w:hanging="425"/>
+      </w:pPr>
+      <w:r>
+        <w:rPr>
+          <w:b w:val="0"/>
+        </w:rPr>
+        <w:t xml:space="preserve">11. </w:t>
+      </w:r>
+      <w:r>
+        <w:t>Universiti Tun Hussein Onn Malaysia. (2025). Applied Information Technology and Computer Science. https://periodical.uthm.edu.my/index.php/aitcs</w:t>
+      </w:r>
+    </w:p>
+    <w:p>
+      <w:pPr>
+        <w:spacing w:after="120"/>
+        <w:ind w:left="425" w:hanging="425"/>
+      </w:pPr>
+      <w:r>
+        <w:rPr>
+          <w:b w:val="0"/>
+        </w:rPr>
+        <w:t xml:space="preserve">12. </w:t>
       </w:r>
       <w:r>
         <w:t>Universiti Tun Hussein Onn Malaysia. (2025). Buku panduan Projek Sarjana Muda (PSM). Fakulti Sains Komputer dan Teknologi Maklumat, UTHM.</w:t>

</xml_diff>